<commit_message>
Perfectly runs on Kali now
</commit_message>
<xml_diff>
--- a/Installations Guide.docx
+++ b/Installations Guide.docx
@@ -1061,6 +1061,11 @@
     </w:p>
     <w:p>
       <w:pPr>
+        <w:pStyle w:val="ListParagraph"/>
+        <w:numPr>
+          <w:ilvl w:val="0"/>
+          <w:numId w:val="3"/>
+        </w:numPr>
         <w:spacing w:after="0" w:line="240" w:lineRule="auto"/>
         <w:rPr>
           <w:rFonts w:ascii="Calibri" w:hAnsi="Calibri" w:cs="Calibri"/>
@@ -1695,7 +1700,7 @@
   <w:abstractNum w:abstractNumId="5" w15:restartNumberingAfterBreak="0">
     <w:nsid w:val="7A6E2908"/>
     <w:multiLevelType w:val="hybridMultilevel"/>
-    <w:tmpl w:val="DC8C7680"/>
+    <w:tmpl w:val="E3DAB618"/>
     <w:lvl w:ilvl="0" w:tplc="08090001">
       <w:start w:val="1"/>
       <w:numFmt w:val="bullet"/>

</xml_diff>